<commit_message>
Refocus portfolio on engineering outcomes and refresh resume
</commit_message>
<xml_diff>
--- a/static/adam_robinson.docx
+++ b/static/adam_robinson.docx
@@ -5,11 +5,13 @@
     <w:p>
       <w:pPr>
         <w:pStyle w:val="Title"/>
-        <w:spacing w:line="240" w:lineRule="auto" w:before="0" w:after="40"/>
+        <w:keepNext w:val="0"/>
+        <w:widowControl/>
+        <w:spacing w:before="0" w:after="60" w:line="520" w:lineRule="exact"/>
       </w:pPr>
       <w:r>
         <w:rPr>
-          <w:rFonts w:ascii="JetBrains Mono" w:hAnsi="JetBrains Mono"/>
+          <w:rFonts w:ascii="Arial" w:hAnsi="Arial"/>
           <w:b w:val="0"/>
           <w:color w:val="0A0A0A"/>
           <w:sz w:val="44"/>
@@ -19,98 +21,81 @@
     </w:p>
     <w:p>
       <w:pPr>
-        <w:spacing w:line="240" w:lineRule="auto" w:before="0" w:after="80"/>
+        <w:keepNext w:val="0"/>
+        <w:widowControl/>
+        <w:spacing w:before="0" w:after="60" w:line="260" w:lineRule="exact"/>
       </w:pPr>
       <w:r>
         <w:rPr>
-          <w:rFonts w:ascii="JetBrains Mono" w:hAnsi="JetBrains Mono"/>
+          <w:rFonts w:ascii="Arial" w:hAnsi="Arial"/>
+          <w:b w:val="0"/>
           <w:color w:val="2A7A7A"/>
           <w:sz w:val="18"/>
         </w:rPr>
-        <w:t>SENIOR SOFTWARE ENGINEER</w:t>
+        <w:t>SENIOR SOFTWARE ENGINEER &amp; TECHNICAL LEAD</w:t>
       </w:r>
     </w:p>
     <w:p>
       <w:pPr>
-        <w:spacing w:line="240" w:lineRule="auto" w:before="0" w:after="40"/>
+        <w:keepNext/>
+        <w:widowControl/>
+        <w:spacing w:before="0" w:after="100" w:line="240" w:lineRule="exact"/>
       </w:pPr>
       <w:r>
         <w:rPr>
-          <w:rFonts w:ascii="Calibri" w:hAnsi="Calibri"/>
-          <w:color w:val="444444"/>
-          <w:sz w:val="20"/>
+          <w:rFonts w:ascii="Arial" w:hAnsi="Arial"/>
+          <w:b w:val="0"/>
+          <w:color w:val="555555"/>
+          <w:sz w:val="18"/>
         </w:rPr>
-        <w:t>Providence, RI</w:t>
+        <w:t>Providence, RI · Remote</w:t>
       </w:r>
     </w:p>
     <w:p>
       <w:pPr>
-        <w:spacing w:line="240" w:lineRule="auto" w:before="0" w:after="160"/>
+        <w:spacing w:after="100"/>
       </w:pPr>
       <w:hyperlink r:id="rId9">
         <w:r>
           <w:rPr>
-            <w:rFonts w:ascii="Calibri" w:hAnsi="Calibri"/>
+            <w:color w:val="555555"/>
             <w:sz w:val="18"/>
-            <w:color w:val="444444"/>
-            <w:u w:val="none"/>
           </w:rPr>
           <w:t>adamrobinson.tech</w:t>
         </w:r>
       </w:hyperlink>
       <w:r>
-        <w:rPr>
-          <w:rFonts w:ascii="Calibri" w:hAnsi="Calibri"/>
-          <w:color w:val="444444"/>
-          <w:sz w:val="18"/>
-        </w:rPr>
-        <w:t xml:space="preserve">  ·  </w:t>
+        <w:t xml:space="preserve"> · </w:t>
       </w:r>
       <w:hyperlink r:id="rId10">
         <w:r>
           <w:rPr>
-            <w:rFonts w:ascii="Calibri" w:hAnsi="Calibri"/>
+            <w:color w:val="555555"/>
             <w:sz w:val="18"/>
-            <w:color w:val="444444"/>
-            <w:u w:val="none"/>
           </w:rPr>
           <w:t>GitHub</w:t>
         </w:r>
       </w:hyperlink>
       <w:r>
-        <w:rPr>
-          <w:rFonts w:ascii="Calibri" w:hAnsi="Calibri"/>
-          <w:color w:val="444444"/>
-          <w:sz w:val="18"/>
-        </w:rPr>
-        <w:t xml:space="preserve">  ·  </w:t>
+        <w:t xml:space="preserve"> · </w:t>
       </w:r>
       <w:hyperlink r:id="rId11">
         <w:r>
           <w:rPr>
-            <w:rFonts w:ascii="Calibri" w:hAnsi="Calibri"/>
+            <w:color w:val="555555"/>
             <w:sz w:val="18"/>
-            <w:color w:val="444444"/>
-            <w:u w:val="none"/>
           </w:rPr>
           <w:t>LinkedIn</w:t>
         </w:r>
       </w:hyperlink>
       <w:r>
-        <w:rPr>
-          <w:rFonts w:ascii="Calibri" w:hAnsi="Calibri"/>
-          <w:color w:val="444444"/>
-          <w:sz w:val="18"/>
-        </w:rPr>
-        <w:t xml:space="preserve">  ·  </w:t>
+        <w:t xml:space="preserve"> · </w:t>
       </w:r>
       <w:hyperlink r:id="rId12">
         <w:r>
           <w:rPr>
-            <w:rFonts w:ascii="Calibri" w:hAnsi="Calibri"/>
+            <w:color w:val="555555"/>
             <w:sz w:val="18"/>
-            <w:color w:val="444444"/>
-            <w:u w:val="none"/>
           </w:rPr>
           <w:t>adam@adamrobinson.tech</w:t>
         </w:r>
@@ -118,464 +103,728 @@
     </w:p>
     <w:p>
       <w:pPr>
-        <w:spacing w:line="240" w:lineRule="auto" w:before="100" w:after="100"/>
-        <w:pBdr>
-          <w:bottom w:val="single" w:sz="4" w:space="1" w:color="2A7A7A"/>
-        </w:pBdr>
-      </w:pPr>
-    </w:p>
-    <w:p>
-      <w:pPr>
-        <w:spacing w:line="240" w:lineRule="auto" w:before="40" w:after="60"/>
+        <w:pStyle w:val="Heading1"/>
+        <w:keepNext/>
+        <w:widowControl/>
+        <w:spacing w:before="240" w:after="120" w:line="240" w:lineRule="exact"/>
       </w:pPr>
       <w:r>
         <w:rPr>
-          <w:rFonts w:ascii="JetBrains Mono" w:hAnsi="JetBrains Mono"/>
+          <w:rFonts w:ascii="Arial" w:hAnsi="Arial"/>
+          <w:b/>
           <w:color w:val="2A7A7A"/>
-          <w:sz w:val="16"/>
+          <w:sz w:val="18"/>
         </w:rPr>
-        <w:t>SUMMARY</w:t>
+        <w:t>Professional Summary</w:t>
       </w:r>
     </w:p>
     <w:p>
       <w:pPr>
-        <w:spacing w:line="240" w:lineRule="auto" w:before="0" w:after="80"/>
+        <w:keepNext w:val="0"/>
+        <w:widowControl/>
+        <w:spacing w:before="0" w:after="100" w:line="270" w:lineRule="exact"/>
       </w:pPr>
       <w:r>
         <w:rPr>
-          <w:rFonts w:ascii="Calibri" w:hAnsi="Calibri"/>
+          <w:rFonts w:ascii="Arial" w:hAnsi="Arial"/>
+          <w:b w:val="0"/>
           <w:color w:val="0A0A0A"/>
           <w:sz w:val="20"/>
         </w:rPr>
-        <w:t>Senior software engineer and technical lead with 15+ years of experience building production software. My work spans full-stack feature development, backend service architecture, and platform modernization. I combine hands-on development with technical leadership, from defining goals and technical approaches to coordinating delivery and mentoring engineers.</w:t>
+        <w:t>Solutions-focused technical leader with 15+ years of experience translating complex business and operational needs into production software, platform architecture, and modernization plans. Trusted across 15+ embedded client engagements in fintech, healthcare, industrial technology, insurance, and enterprise environments. Combines systems thinking, stakeholder discovery, technical decision-making, and cross-functional delivery with enough hands-on depth to guide implementation, resolve ambiguity, and carry solutions into production.</w:t>
       </w:r>
     </w:p>
     <w:p>
       <w:pPr>
-        <w:spacing w:line="240" w:lineRule="auto" w:before="100" w:after="100"/>
-        <w:pBdr>
-          <w:bottom w:val="single" w:sz="4" w:space="1" w:color="2A7A7A"/>
-        </w:pBdr>
-      </w:pPr>
-    </w:p>
-    <w:p>
-      <w:pPr>
-        <w:spacing w:line="240" w:lineRule="auto" w:before="40" w:after="60"/>
+        <w:pStyle w:val="Heading1"/>
+        <w:keepNext/>
+        <w:widowControl/>
+        <w:spacing w:before="240" w:after="120" w:line="240" w:lineRule="exact"/>
       </w:pPr>
       <w:r>
         <w:rPr>
-          <w:rFonts w:ascii="JetBrains Mono" w:hAnsi="JetBrains Mono"/>
+          <w:rFonts w:ascii="Arial" w:hAnsi="Arial"/>
+          <w:b/>
           <w:color w:val="2A7A7A"/>
-          <w:sz w:val="16"/>
+          <w:sz w:val="18"/>
         </w:rPr>
-        <w:t>EXPERIENCE</w:t>
+        <w:t>Selected Outcomes</w:t>
       </w:r>
     </w:p>
     <w:p>
       <w:pPr>
-        <w:spacing w:line="240" w:lineRule="auto" w:before="100" w:after="20"/>
+        <w:keepNext w:val="0"/>
+        <w:widowControl/>
+        <w:spacing w:before="0" w:after="100" w:line="270" w:lineRule="exact"/>
+        <w:ind w:left="200" w:hanging="160"/>
       </w:pPr>
       <w:r>
         <w:rPr>
-          <w:rFonts w:ascii="Calibri" w:hAnsi="Calibri"/>
-          <w:b/>
+          <w:rFonts w:ascii="Arial" w:hAnsi="Arial"/>
+          <w:b w:val="0"/>
           <w:color w:val="0A0A0A"/>
           <w:sz w:val="20"/>
         </w:rPr>
-        <w:t>MojoTech</w:t>
-      </w:r>
-      <w:r>
-        <w:rPr>
-          <w:rFonts w:ascii="Calibri" w:hAnsi="Calibri"/>
-          <w:b w:val="0"/>
-          <w:color w:val="444444"/>
-          <w:sz w:val="20"/>
-        </w:rPr>
-        <w:t xml:space="preserve">  ·  Senior Software Engineer / Technical Lead</w:t>
+        <w:t>• Reduced a core healthcare publishing workflow from weeks to a couple of days by co-designing and delivering a headless CMS architecture.</w:t>
       </w:r>
     </w:p>
     <w:p>
       <w:pPr>
-        <w:spacing w:line="240" w:lineRule="auto" w:before="0" w:after="80"/>
+        <w:keepNext w:val="0"/>
+        <w:widowControl/>
+        <w:spacing w:before="0" w:after="100" w:line="270" w:lineRule="exact"/>
+        <w:ind w:left="200" w:hanging="160"/>
       </w:pPr>
       <w:r>
         <w:rPr>
-          <w:rFonts w:ascii="JetBrains Mono" w:hAnsi="JetBrains Mono"/>
-          <w:color w:val="444444"/>
-          <w:sz w:val="16"/>
+          <w:rFonts w:ascii="Arial" w:hAnsi="Arial"/>
+          <w:b w:val="0"/>
+          <w:color w:val="0A0A0A"/>
+          <w:sz w:val="20"/>
         </w:rPr>
-        <w:t>Feb 2015 - Present  ·  Providence, RI</w:t>
+        <w:t>• Defined the scope and delivered an industrial decommissioning MVP on schedule after resolving domain and planning ambiguity through an onsite Design Sprint.</w:t>
       </w:r>
     </w:p>
     <w:p>
       <w:pPr>
-        <w:spacing w:line="240" w:lineRule="auto" w:before="0" w:after="120"/>
+        <w:keepNext w:val="0"/>
+        <w:widowControl/>
+        <w:spacing w:before="0" w:after="100" w:line="270" w:lineRule="exact"/>
+        <w:ind w:left="200" w:hanging="160"/>
       </w:pPr>
       <w:r>
         <w:rPr>
-          <w:rFonts w:ascii="Calibri" w:hAnsi="Calibri"/>
+          <w:rFonts w:ascii="Arial" w:hAnsi="Arial"/>
+          <w:b w:val="0"/>
           <w:color w:val="0A0A0A"/>
           <w:sz w:val="20"/>
         </w:rPr>
-        <w:t>Software consultancy. Embedded with client teams across 15+ engagements. Selected client engagements:</w:t>
+        <w:t>• Helped architect a Rails service boundary for specialized international investment processing and advanced shared localization and frontend-platform capabilities.</w:t>
       </w:r>
     </w:p>
     <w:p>
       <w:pPr>
-        <w:spacing w:line="240" w:lineRule="auto" w:before="100" w:after="20"/>
-        <w:ind w:left="259"/>
+        <w:pStyle w:val="Heading1"/>
+        <w:keepNext/>
+        <w:widowControl/>
+        <w:spacing w:before="240" w:after="120" w:line="240" w:lineRule="exact"/>
       </w:pPr>
       <w:r>
         <w:rPr>
-          <w:rFonts w:ascii="Calibri" w:hAnsi="Calibri"/>
+          <w:rFonts w:ascii="Arial" w:hAnsi="Arial"/>
+          <w:b/>
           <w:color w:val="2A7A7A"/>
           <w:sz w:val="18"/>
         </w:rPr>
-        <w:t xml:space="preserve">-  </w:t>
-      </w:r>
-      <w:r>
-        <w:rPr>
-          <w:rFonts w:ascii="Calibri" w:hAnsi="Calibri"/>
-          <w:b/>
-          <w:color w:val="0A0A0A"/>
-          <w:sz w:val="19"/>
-        </w:rPr>
-        <w:t>iCapital</w:t>
-      </w:r>
-      <w:r>
-        <w:rPr>
-          <w:rFonts w:ascii="Calibri" w:hAnsi="Calibri"/>
-          <w:b w:val="0"/>
-          <w:color w:val="444444"/>
-          <w:sz w:val="18"/>
-        </w:rPr>
-        <w:t xml:space="preserve">  ·  Senior Software Engineer, Consultant  ·  May 2024 - present</w:t>
+        <w:t>Professional Experience</w:t>
       </w:r>
     </w:p>
     <w:p>
       <w:pPr>
-        <w:spacing w:line="240" w:lineRule="auto" w:before="0" w:after="60"/>
-        <w:ind w:left="504"/>
+        <w:pStyle w:val="Heading2"/>
+        <w:keepNext/>
+        <w:widowControl/>
+        <w:spacing w:before="180" w:after="40" w:line="280" w:lineRule="exact"/>
       </w:pPr>
       <w:r>
         <w:rPr>
-          <w:rFonts w:ascii="Calibri" w:hAnsi="Calibri"/>
+          <w:rFonts w:ascii="Arial" w:hAnsi="Arial"/>
+          <w:b/>
           <w:color w:val="0A0A0A"/>
-          <w:sz w:val="19"/>
+          <w:sz w:val="21"/>
         </w:rPr>
-        <w:t>Develop features across iCapital’s investment platform. Helped architect and implement a Rails backend service for the Nominees reimplementation, supporting specialized international investments. Worked on backend translation migration using Mobility. Currently migrating custom frontend forms to a shared internal package.</w:t>
+        <w:t>MojoTech · Senior Software Engineer and Technical Lead</w:t>
       </w:r>
     </w:p>
     <w:p>
       <w:pPr>
-        <w:spacing w:line="240" w:lineRule="auto" w:before="100" w:after="20"/>
-        <w:ind w:left="259"/>
+        <w:keepNext/>
+        <w:widowControl/>
+        <w:spacing w:before="0" w:after="100" w:line="240" w:lineRule="exact"/>
       </w:pPr>
       <w:r>
         <w:rPr>
-          <w:rFonts w:ascii="Calibri" w:hAnsi="Calibri"/>
-          <w:color w:val="2A7A7A"/>
+          <w:rFonts w:ascii="Arial" w:hAnsi="Arial"/>
+          <w:b w:val="0"/>
+          <w:color w:val="555555"/>
           <w:sz w:val="18"/>
         </w:rPr>
-        <w:t xml:space="preserve">-  </w:t>
-      </w:r>
-      <w:r>
-        <w:rPr>
-          <w:rFonts w:ascii="Calibri" w:hAnsi="Calibri"/>
-          <w:b/>
-          <w:color w:val="0A0A0A"/>
-          <w:sz w:val="19"/>
-        </w:rPr>
-        <w:t>Healthcasts</w:t>
-      </w:r>
-      <w:r>
-        <w:rPr>
-          <w:rFonts w:ascii="Calibri" w:hAnsi="Calibri"/>
-          <w:b w:val="0"/>
-          <w:color w:val="444444"/>
-          <w:sz w:val="18"/>
-        </w:rPr>
-        <w:t xml:space="preserve">  ·  Technical Lead  ·  Oct 2022 - May 2024</w:t>
+        <w:t>Feb 2015–Present · Providence, RI and remote</w:t>
       </w:r>
     </w:p>
     <w:p>
       <w:pPr>
-        <w:spacing w:line="240" w:lineRule="auto" w:before="0" w:after="60"/>
-        <w:ind w:left="504"/>
+        <w:keepNext w:val="0"/>
+        <w:widowControl/>
+        <w:spacing w:before="0" w:after="100" w:line="270" w:lineRule="exact"/>
       </w:pPr>
       <w:r>
         <w:rPr>
-          <w:rFonts w:ascii="Calibri" w:hAnsi="Calibri"/>
+          <w:rFonts w:ascii="Arial" w:hAnsi="Arial"/>
+          <w:b w:val="0"/>
           <w:color w:val="0A0A0A"/>
-          <w:sz w:val="19"/>
+          <w:sz w:val="20"/>
         </w:rPr>
-        <w:t>Led development across publishing, authentication, and AI platform initiatives, helping define goals and technical approaches while implementing throughout. Co-designed and built a headless CMS workflow with another engineer, reducing a core process from weeks to a couple of days. Helped define and led an Auth0 authentication strategy requiring an extensive authentication-layer and backend rewrite. Led development and implemented parts of the AI platform.</w:t>
+        <w:t>Software consultancy · Embedded across 15+ client organizations</w:t>
       </w:r>
     </w:p>
     <w:p>
       <w:pPr>
-        <w:spacing w:line="240" w:lineRule="auto" w:before="100" w:after="20"/>
-        <w:ind w:left="259"/>
+        <w:pStyle w:val="Heading2"/>
+        <w:keepNext/>
+        <w:widowControl/>
+        <w:spacing w:before="180" w:after="40" w:line="280" w:lineRule="exact"/>
       </w:pPr>
       <w:r>
         <w:rPr>
-          <w:rFonts w:ascii="Calibri" w:hAnsi="Calibri"/>
-          <w:color w:val="2A7A7A"/>
-          <w:sz w:val="18"/>
-        </w:rPr>
-        <w:t xml:space="preserve">-  </w:t>
-      </w:r>
-      <w:r>
-        <w:rPr>
-          <w:rFonts w:ascii="Calibri" w:hAnsi="Calibri"/>
+          <w:rFonts w:ascii="Arial" w:hAnsi="Arial"/>
           <w:b/>
           <w:color w:val="0A0A0A"/>
-          <w:sz w:val="19"/>
+          <w:sz w:val="21"/>
         </w:rPr>
-        <w:t>Angi</w:t>
-      </w:r>
-      <w:r>
-        <w:rPr>
-          <w:rFonts w:ascii="Calibri" w:hAnsi="Calibri"/>
-          <w:b w:val="0"/>
-          <w:color w:val="444444"/>
-          <w:sz w:val="18"/>
-        </w:rPr>
-        <w:t xml:space="preserve">  ·  Senior Software Engineer, Consultant  ·  Nov 2020 - Sep 2022</w:t>
+        <w:t>iCapital · Senior Software Engineer Consultant</w:t>
       </w:r>
     </w:p>
     <w:p>
       <w:pPr>
-        <w:spacing w:line="240" w:lineRule="auto" w:before="0" w:after="60"/>
-        <w:ind w:left="504"/>
+        <w:keepNext/>
+        <w:widowControl/>
+        <w:spacing w:before="0" w:after="100" w:line="240" w:lineRule="exact"/>
       </w:pPr>
       <w:r>
         <w:rPr>
-          <w:rFonts w:ascii="Calibri" w:hAnsi="Calibri"/>
-          <w:color w:val="0A0A0A"/>
-          <w:sz w:val="19"/>
+          <w:rFonts w:ascii="Arial" w:hAnsi="Arial"/>
+          <w:b w:val="0"/>
+          <w:color w:val="555555"/>
+          <w:sz w:val="18"/>
         </w:rPr>
-        <w:t>Developed Java/Vue.js features for the unified quiz flow during the Angi rebrand, then React/Rails features at Handy and Contentful/Next.js pages at Angi. Managed interns rebuilding the Careers page, then took over the remaining implementation after their internships ended.</w:t>
+        <w:t>May 2024–Present · via MojoTech</w:t>
       </w:r>
     </w:p>
     <w:p>
       <w:pPr>
-        <w:spacing w:line="240" w:lineRule="auto" w:before="100" w:after="20"/>
-        <w:ind w:left="259"/>
+        <w:keepNext w:val="0"/>
+        <w:widowControl/>
+        <w:spacing w:before="0" w:after="100" w:line="270" w:lineRule="exact"/>
+        <w:ind w:left="200" w:hanging="160"/>
       </w:pPr>
       <w:r>
         <w:rPr>
-          <w:rFonts w:ascii="Calibri" w:hAnsi="Calibri"/>
-          <w:color w:val="2A7A7A"/>
-          <w:sz w:val="18"/>
+          <w:rFonts w:ascii="Arial" w:hAnsi="Arial"/>
+          <w:b w:val="0"/>
+          <w:color w:val="0A0A0A"/>
+          <w:sz w:val="20"/>
         </w:rPr>
-        <w:t xml:space="preserve">-  </w:t>
-      </w:r>
-      <w:r>
-        <w:rPr>
-          <w:rFonts w:ascii="Calibri" w:hAnsi="Calibri"/>
-          <w:b/>
-          <w:color w:val="0A0A0A"/>
-          <w:sz w:val="19"/>
-        </w:rPr>
-        <w:t>Shell Techworks</w:t>
-      </w:r>
-      <w:r>
-        <w:rPr>
-          <w:rFonts w:ascii="Calibri" w:hAnsi="Calibri"/>
-          <w:b w:val="0"/>
-          <w:color w:val="444444"/>
-          <w:sz w:val="18"/>
-        </w:rPr>
-        <w:t xml:space="preserve">  ·  Software Engineer  ·  Jun 2018 - Jul 2019</w:t>
+        <w:t>• Helped architect and implement a Rails backend service for Nominees, a business unit supporting specialized international investments; translated complex domain workflows into a maintainable service boundary.</w:t>
       </w:r>
     </w:p>
     <w:p>
       <w:pPr>
-        <w:spacing w:line="240" w:lineRule="auto" w:before="0" w:after="60"/>
-        <w:ind w:left="504"/>
+        <w:keepNext w:val="0"/>
+        <w:widowControl/>
+        <w:spacing w:before="0" w:after="100" w:line="270" w:lineRule="exact"/>
+        <w:ind w:left="200" w:hanging="160"/>
       </w:pPr>
       <w:r>
         <w:rPr>
-          <w:rFonts w:ascii="Calibri" w:hAnsi="Calibri"/>
+          <w:rFonts w:ascii="Arial" w:hAnsi="Arial"/>
+          <w:b w:val="0"/>
           <w:color w:val="0A0A0A"/>
-          <w:sz w:val="19"/>
+          <w:sz w:val="20"/>
         </w:rPr>
-        <w:t>Built a React and Node.js application that evaluated least-cost decommissioning paths for end-of-life offshore oil platforms. Used an onsite Google Design Sprint to narrow scope and deliver the MVP on schedule.</w:t>
+        <w:t>• Modernized backend localization with Mobility and migrated custom frontend forms toward a shared internal package, improving consistency and reuse across the investment platform.</w:t>
       </w:r>
     </w:p>
     <w:p>
       <w:pPr>
-        <w:spacing w:line="240" w:lineRule="auto" w:before="120" w:after="60"/>
-        <w:ind w:left="504"/>
+        <w:keepNext w:val="0"/>
+        <w:widowControl/>
+        <w:spacing w:before="0" w:after="100" w:line="270" w:lineRule="exact"/>
+        <w:ind w:left="200" w:hanging="160"/>
       </w:pPr>
       <w:r>
         <w:rPr>
-          <w:rFonts w:ascii="Calibri" w:hAnsi="Calibri"/>
-          <w:i/>
-          <w:color w:val="444444"/>
-          <w:sz w:val="18"/>
+          <w:rFonts w:ascii="Arial" w:hAnsi="Arial"/>
+          <w:b w:val="0"/>
+          <w:color w:val="0A0A0A"/>
+          <w:sz w:val="20"/>
         </w:rPr>
-        <w:t>Additional client engagements: Two Sigma · Welltok · Credit Karma · Schneider Electric · School of Motion · Amica Mutual · AutoRaptor.</w:t>
+        <w:t>• Partner across an enterprise engineering environment on feature delivery, service architecture, localization, and shared tooling using Rails, React, TypeScript, and Node.js.</w:t>
       </w:r>
     </w:p>
     <w:p>
       <w:pPr>
-        <w:spacing w:line="240" w:lineRule="auto" w:before="100" w:after="20"/>
+        <w:pStyle w:val="Heading2"/>
+        <w:keepNext/>
+        <w:widowControl/>
+        <w:spacing w:before="180" w:after="40" w:line="280" w:lineRule="exact"/>
       </w:pPr>
       <w:r>
         <w:rPr>
-          <w:rFonts w:ascii="Calibri" w:hAnsi="Calibri"/>
+          <w:rFonts w:ascii="Arial" w:hAnsi="Arial"/>
           <w:b/>
           <w:color w:val="0A0A0A"/>
-          <w:sz w:val="20"/>
+          <w:sz w:val="21"/>
         </w:rPr>
-        <w:t>Beacon Mutual Insurance</w:t>
-      </w:r>
-      <w:r>
-        <w:rPr>
-          <w:rFonts w:ascii="Calibri" w:hAnsi="Calibri"/>
-          <w:b w:val="0"/>
-          <w:color w:val="444444"/>
-          <w:sz w:val="20"/>
-        </w:rPr>
-        <w:t xml:space="preserve">  ·  Associate Developer / Production Control</w:t>
+        <w:t>Healthcasts · Technical Lead</w:t>
       </w:r>
     </w:p>
     <w:p>
       <w:pPr>
-        <w:spacing w:line="240" w:lineRule="auto" w:before="0" w:after="80"/>
+        <w:keepNext/>
+        <w:widowControl/>
+        <w:spacing w:before="0" w:after="100" w:line="240" w:lineRule="exact"/>
       </w:pPr>
       <w:r>
         <w:rPr>
-          <w:rFonts w:ascii="JetBrains Mono" w:hAnsi="JetBrains Mono"/>
-          <w:color w:val="444444"/>
-          <w:sz w:val="16"/>
+          <w:rFonts w:ascii="Arial" w:hAnsi="Arial"/>
+          <w:b w:val="0"/>
+          <w:color w:val="555555"/>
+          <w:sz w:val="18"/>
         </w:rPr>
-        <w:t>Mar 2011 - Feb 2015  ·  Warwick, RI</w:t>
+        <w:t>Oct 2022–May 2024 · via MojoTech</w:t>
       </w:r>
     </w:p>
     <w:p>
       <w:pPr>
-        <w:spacing w:line="240" w:lineRule="auto" w:before="0" w:after="80"/>
+        <w:keepNext w:val="0"/>
+        <w:widowControl/>
+        <w:spacing w:before="0" w:after="100" w:line="270" w:lineRule="exact"/>
+        <w:ind w:left="200" w:hanging="160"/>
       </w:pPr>
       <w:r>
         <w:rPr>
-          <w:rFonts w:ascii="Calibri" w:hAnsi="Calibri"/>
+          <w:rFonts w:ascii="Arial" w:hAnsi="Arial"/>
+          <w:b w:val="0"/>
           <w:color w:val="0A0A0A"/>
           <w:sz w:val="20"/>
         </w:rPr>
-        <w:t>Progressed from deployment and environment management to full-stack and database development, building claims, policy, financial transaction, and payment systems in a regulated environment.</w:t>
+        <w:t>• Led technical direction and delivery across publishing, identity, and AI-platform initiatives, helping define project goals, solution approaches, and phased implementation plans.</w:t>
       </w:r>
     </w:p>
     <w:p>
       <w:pPr>
-        <w:spacing w:line="240" w:lineRule="auto" w:before="100" w:after="100"/>
-        <w:pBdr>
-          <w:bottom w:val="single" w:sz="4" w:space="1" w:color="2A7A7A"/>
-        </w:pBdr>
-      </w:pPr>
-    </w:p>
-    <w:p>
-      <w:pPr>
-        <w:spacing w:line="240" w:lineRule="auto" w:before="40" w:after="60"/>
+        <w:keepNext w:val="0"/>
+        <w:widowControl/>
+        <w:spacing w:before="0" w:after="100" w:line="270" w:lineRule="exact"/>
+        <w:ind w:left="200" w:hanging="160"/>
       </w:pPr>
       <w:r>
         <w:rPr>
-          <w:rFonts w:ascii="JetBrains Mono" w:hAnsi="JetBrains Mono"/>
-          <w:color w:val="2A7A7A"/>
-          <w:sz w:val="16"/>
+          <w:rFonts w:ascii="Arial" w:hAnsi="Arial"/>
+          <w:b w:val="0"/>
+          <w:color w:val="0A0A0A"/>
+          <w:sz w:val="20"/>
         </w:rPr>
-        <w:t>SKILLS</w:t>
+        <w:t>• Co-designed and implemented a Strapi and React headless CMS workflow that reduced a core publishing process from weeks to a couple of days.</w:t>
       </w:r>
     </w:p>
     <w:p>
       <w:pPr>
-        <w:spacing w:line="240" w:lineRule="auto" w:before="0" w:after="40"/>
+        <w:keepNext w:val="0"/>
+        <w:widowControl/>
+        <w:spacing w:before="0" w:after="100" w:line="270" w:lineRule="exact"/>
+        <w:ind w:left="200" w:hanging="160"/>
       </w:pPr>
       <w:r>
         <w:rPr>
-          <w:rFonts w:ascii="JetBrains Mono" w:hAnsi="JetBrains Mono"/>
-          <w:color w:val="2A7A7A"/>
-          <w:sz w:val="18"/>
-        </w:rPr>
-        <w:t xml:space="preserve">Core stack  ·  </w:t>
-      </w:r>
-      <w:r>
-        <w:rPr>
-          <w:rFonts w:ascii="Calibri" w:hAnsi="Calibri"/>
-          <w:color w:val="444444"/>
+          <w:rFonts w:ascii="Arial" w:hAnsi="Arial"/>
+          <w:b w:val="0"/>
+          <w:color w:val="0A0A0A"/>
           <w:sz w:val="20"/>
         </w:rPr>
-        <w:t>TypeScript, React, Ruby on Rails, Node.js, SQL</w:t>
+        <w:t>• Helped define and led an Auth0 authentication strategy, including an extensive rewrite of the authentication layer and backend; later led development and implementation of portions of the client’s AI platform.</w:t>
+      </w:r>
+    </w:p>
+    <w:p>
+      <w:r>
+        <w:br w:type="page"/>
       </w:r>
     </w:p>
     <w:p>
       <w:pPr>
-        <w:spacing w:line="240" w:lineRule="auto" w:before="0" w:after="40"/>
+        <w:keepNext w:val="0"/>
+        <w:widowControl/>
+        <w:spacing w:before="0" w:after="100" w:line="240" w:lineRule="exact"/>
       </w:pPr>
       <w:r>
         <w:rPr>
-          <w:rFonts w:ascii="JetBrains Mono" w:hAnsi="JetBrains Mono"/>
-          <w:color w:val="2A7A7A"/>
+          <w:rFonts w:ascii="Arial" w:hAnsi="Arial"/>
+          <w:b w:val="0"/>
+          <w:color w:val="555555"/>
           <w:sz w:val="18"/>
         </w:rPr>
-        <w:t xml:space="preserve">Delivery range  ·  </w:t>
-      </w:r>
-      <w:r>
-        <w:rPr>
-          <w:rFonts w:ascii="Calibri" w:hAnsi="Calibri"/>
-          <w:color w:val="444444"/>
-          <w:sz w:val="20"/>
-        </w:rPr>
-        <w:t>Vue, Next.js, SvelteKit, Java, PHP (legacy)</w:t>
+        <w:t>Adam Robinson · Professional Experience continued</w:t>
       </w:r>
     </w:p>
     <w:p>
       <w:pPr>
-        <w:spacing w:line="240" w:lineRule="auto" w:before="0" w:after="40"/>
+        <w:pStyle w:val="Heading2"/>
+        <w:keepNext/>
+        <w:widowControl/>
+        <w:spacing w:before="180" w:after="40" w:line="280" w:lineRule="exact"/>
       </w:pPr>
       <w:r>
         <w:rPr>
-          <w:rFonts w:ascii="JetBrains Mono" w:hAnsi="JetBrains Mono"/>
-          <w:color w:val="2A7A7A"/>
-          <w:sz w:val="18"/>
+          <w:rFonts w:ascii="Arial" w:hAnsi="Arial"/>
+          <w:b/>
+          <w:color w:val="0A0A0A"/>
+          <w:sz w:val="21"/>
         </w:rPr>
-        <w:t xml:space="preserve">Platform work  ·  </w:t>
-      </w:r>
-      <w:r>
-        <w:rPr>
-          <w:rFonts w:ascii="Calibri" w:hAnsi="Calibri"/>
-          <w:color w:val="444444"/>
-          <w:sz w:val="20"/>
-        </w:rPr>
-        <w:t>AWS/EC2, GitHub Actions, Auth0, Strapi, Contentful, Mobility</w:t>
+        <w:t>Angi and Handy · Senior Software Engineer Consultant</w:t>
       </w:r>
     </w:p>
     <w:p>
       <w:pPr>
-        <w:spacing w:line="240" w:lineRule="auto" w:before="0" w:after="40"/>
+        <w:keepNext/>
+        <w:widowControl/>
+        <w:spacing w:before="0" w:after="100" w:line="240" w:lineRule="exact"/>
       </w:pPr>
       <w:r>
         <w:rPr>
-          <w:rFonts w:ascii="JetBrains Mono" w:hAnsi="JetBrains Mono"/>
+          <w:rFonts w:ascii="Arial" w:hAnsi="Arial"/>
+          <w:b w:val="0"/>
+          <w:color w:val="555555"/>
+          <w:sz w:val="18"/>
+        </w:rPr>
+        <w:t>Nov 2020–Sep 2022 · via MojoTech</w:t>
+      </w:r>
+    </w:p>
+    <w:p>
+      <w:pPr>
+        <w:keepNext w:val="0"/>
+        <w:widowControl/>
+        <w:spacing w:before="0" w:after="100" w:line="270" w:lineRule="exact"/>
+        <w:ind w:left="200" w:hanging="160"/>
+      </w:pPr>
+      <w:r>
+        <w:rPr>
+          <w:rFonts w:ascii="Arial" w:hAnsi="Arial"/>
+          <w:b w:val="0"/>
+          <w:color w:val="0A0A0A"/>
+          <w:sz w:val="20"/>
+        </w:rPr>
+        <w:t>• Delivered backend and frontend capabilities across the Angi rebrand and multiple product platforms using Java, Vue, React, Rails, Next.js, and Contentful.</w:t>
+      </w:r>
+    </w:p>
+    <w:p>
+      <w:pPr>
+        <w:keepNext w:val="0"/>
+        <w:widowControl/>
+        <w:spacing w:before="0" w:after="100" w:line="270" w:lineRule="exact"/>
+        <w:ind w:left="200" w:hanging="160"/>
+      </w:pPr>
+      <w:r>
+        <w:rPr>
+          <w:rFonts w:ascii="Arial" w:hAnsi="Arial"/>
+          <w:b w:val="0"/>
+          <w:color w:val="0A0A0A"/>
+          <w:sz w:val="20"/>
+        </w:rPr>
+        <w:t>• Adapted to changing business priorities and technology stacks while maintaining delivery continuity across the unified quiz flow, Handy product work, and CMS-driven Angi experiences.</w:t>
+      </w:r>
+    </w:p>
+    <w:p>
+      <w:pPr>
+        <w:keepNext w:val="0"/>
+        <w:widowControl/>
+        <w:spacing w:before="0" w:after="100" w:line="270" w:lineRule="exact"/>
+        <w:ind w:left="200" w:hanging="160"/>
+      </w:pPr>
+      <w:r>
+        <w:rPr>
+          <w:rFonts w:ascii="Arial" w:hAnsi="Arial"/>
+          <w:b w:val="0"/>
+          <w:color w:val="0A0A0A"/>
+          <w:sz w:val="20"/>
+        </w:rPr>
+        <w:t>• Managed interns rebuilding the Careers experience, then assumed ownership of the remaining implementation to carry the initiative through completion.</w:t>
+      </w:r>
+    </w:p>
+    <w:p>
+      <w:pPr>
+        <w:pStyle w:val="Heading2"/>
+        <w:keepNext/>
+        <w:widowControl/>
+        <w:spacing w:before="180" w:after="40" w:line="280" w:lineRule="exact"/>
+      </w:pPr>
+      <w:r>
+        <w:rPr>
+          <w:rFonts w:ascii="Arial" w:hAnsi="Arial"/>
+          <w:b/>
+          <w:color w:val="0A0A0A"/>
+          <w:sz w:val="21"/>
+        </w:rPr>
+        <w:t>Shell Techworks · Software Engineer</w:t>
+      </w:r>
+    </w:p>
+    <w:p>
+      <w:pPr>
+        <w:keepNext/>
+        <w:widowControl/>
+        <w:spacing w:before="0" w:after="100" w:line="240" w:lineRule="exact"/>
+      </w:pPr>
+      <w:r>
+        <w:rPr>
+          <w:rFonts w:ascii="Arial" w:hAnsi="Arial"/>
+          <w:b w:val="0"/>
+          <w:color w:val="555555"/>
+          <w:sz w:val="18"/>
+        </w:rPr>
+        <w:t>Jun 2018–Jul 2019 · via MojoTech</w:t>
+      </w:r>
+    </w:p>
+    <w:p>
+      <w:pPr>
+        <w:keepNext w:val="0"/>
+        <w:widowControl/>
+        <w:spacing w:before="0" w:after="100" w:line="270" w:lineRule="exact"/>
+        <w:ind w:left="200" w:hanging="160"/>
+      </w:pPr>
+      <w:r>
+        <w:rPr>
+          <w:rFonts w:ascii="Arial" w:hAnsi="Arial"/>
+          <w:b w:val="0"/>
+          <w:color w:val="0A0A0A"/>
+          <w:sz w:val="20"/>
+        </w:rPr>
+        <w:t>• Worked onsite with business and technical stakeholders to turn an ambiguous, high-cost operational problem into a defined MVP using the Google Design Sprint process.</w:t>
+      </w:r>
+    </w:p>
+    <w:p>
+      <w:pPr>
+        <w:keepNext w:val="0"/>
+        <w:widowControl/>
+        <w:spacing w:before="0" w:after="100" w:line="270" w:lineRule="exact"/>
+        <w:ind w:left="200" w:hanging="160"/>
+      </w:pPr>
+      <w:r>
+        <w:rPr>
+          <w:rFonts w:ascii="Arial" w:hAnsi="Arial"/>
+          <w:b w:val="0"/>
+          <w:color w:val="0A0A0A"/>
+          <w:sz w:val="20"/>
+        </w:rPr>
+        <w:t>• Designed and built a React and Node.js application that ingested offshore-platform data and evaluated least-cost paths for decommissioning end-of-life assets; delivered the MVP on schedule.</w:t>
+      </w:r>
+    </w:p>
+    <w:p>
+      <w:pPr>
+        <w:pStyle w:val="Heading2"/>
+        <w:keepNext/>
+        <w:widowControl/>
+        <w:spacing w:before="180" w:after="40" w:line="280" w:lineRule="exact"/>
+      </w:pPr>
+      <w:r>
+        <w:rPr>
+          <w:rFonts w:ascii="Arial" w:hAnsi="Arial"/>
+          <w:b/>
+          <w:color w:val="0A0A0A"/>
+          <w:sz w:val="21"/>
+        </w:rPr>
+        <w:t>Additional Embedded Client Engagements</w:t>
+      </w:r>
+    </w:p>
+    <w:p>
+      <w:pPr>
+        <w:keepNext/>
+        <w:widowControl/>
+        <w:spacing w:before="0" w:after="100" w:line="240" w:lineRule="exact"/>
+      </w:pPr>
+      <w:r>
+        <w:rPr>
+          <w:rFonts w:ascii="Arial" w:hAnsi="Arial"/>
+          <w:b w:val="0"/>
+          <w:color w:val="555555"/>
+          <w:sz w:val="18"/>
+        </w:rPr>
+        <w:t>2015–2020 · via MojoTech</w:t>
+      </w:r>
+    </w:p>
+    <w:p>
+      <w:pPr>
+        <w:keepNext w:val="0"/>
+        <w:widowControl/>
+        <w:spacing w:before="0" w:after="100" w:line="240" w:lineRule="exact"/>
+      </w:pPr>
+      <w:r>
+        <w:rPr>
+          <w:rFonts w:ascii="Arial" w:hAnsi="Arial"/>
+          <w:b w:val="0"/>
+          <w:color w:val="555555"/>
+          <w:sz w:val="18"/>
+        </w:rPr>
+        <w:t>Two Sigma (investment management) · Credit Karma (consumer finance) · Schneider Electric (industrial technology; technical lead) · Welltok (healthcare) · Amica Mutual (insurance) · School of Motion (education) · AutoRaptor (automotive CRM)</w:t>
+      </w:r>
+    </w:p>
+    <w:p>
+      <w:pPr>
+        <w:pStyle w:val="Heading2"/>
+        <w:keepNext/>
+        <w:widowControl/>
+        <w:spacing w:before="180" w:after="40" w:line="280" w:lineRule="exact"/>
+      </w:pPr>
+      <w:r>
+        <w:rPr>
+          <w:rFonts w:ascii="Arial" w:hAnsi="Arial"/>
+          <w:b/>
+          <w:color w:val="0A0A0A"/>
+          <w:sz w:val="21"/>
+        </w:rPr>
+        <w:t>Beacon Mutual Insurance · Associate Developer and Production Control</w:t>
+      </w:r>
+    </w:p>
+    <w:p>
+      <w:pPr>
+        <w:keepNext/>
+        <w:widowControl/>
+        <w:spacing w:before="0" w:after="100" w:line="240" w:lineRule="exact"/>
+      </w:pPr>
+      <w:r>
+        <w:rPr>
+          <w:rFonts w:ascii="Arial" w:hAnsi="Arial"/>
+          <w:b w:val="0"/>
+          <w:color w:val="555555"/>
+          <w:sz w:val="18"/>
+        </w:rPr>
+        <w:t>Mar 2011–Feb 2015</w:t>
+      </w:r>
+    </w:p>
+    <w:p>
+      <w:pPr>
+        <w:keepNext w:val="0"/>
+        <w:widowControl/>
+        <w:spacing w:before="0" w:after="100" w:line="270" w:lineRule="exact"/>
+        <w:ind w:left="200" w:hanging="160"/>
+      </w:pPr>
+      <w:r>
+        <w:rPr>
+          <w:rFonts w:ascii="Arial" w:hAnsi="Arial"/>
+          <w:b w:val="0"/>
+          <w:color w:val="0A0A0A"/>
+          <w:sz w:val="20"/>
+        </w:rPr>
+        <w:t>• Progressed from deployment and environment management into full-stack and database development for claims, policy, financial transaction, and payment systems in a regulated insurance environment.</w:t>
+      </w:r>
+    </w:p>
+    <w:p>
+      <w:pPr>
+        <w:keepNext w:val="0"/>
+        <w:widowControl/>
+        <w:spacing w:before="0" w:after="100" w:line="270" w:lineRule="exact"/>
+        <w:ind w:left="200" w:hanging="160"/>
+      </w:pPr>
+      <w:r>
+        <w:rPr>
+          <w:rFonts w:ascii="Arial" w:hAnsi="Arial"/>
+          <w:b w:val="0"/>
+          <w:color w:val="0A0A0A"/>
+          <w:sz w:val="20"/>
+        </w:rPr>
+        <w:t>• Built broad operational and application context across production support, releases, databases, and business-critical systems, establishing the foundation for later architecture and consulting work.</w:t>
+      </w:r>
+    </w:p>
+    <w:p>
+      <w:pPr>
+        <w:pStyle w:val="Heading1"/>
+        <w:keepNext/>
+        <w:widowControl/>
+        <w:spacing w:before="240" w:after="120" w:line="240" w:lineRule="exact"/>
+      </w:pPr>
+      <w:r>
+        <w:rPr>
+          <w:rFonts w:ascii="Arial" w:hAnsi="Arial"/>
+          <w:b/>
           <w:color w:val="2A7A7A"/>
           <w:sz w:val="18"/>
         </w:rPr>
-        <w:t xml:space="preserve">Leadership  ·  </w:t>
+        <w:t>Architecture and Delivery Capabilities</w:t>
       </w:r>
+    </w:p>
+    <w:p>
+      <w:pPr>
+        <w:keepNext w:val="0"/>
+        <w:widowControl/>
+        <w:spacing w:before="0" w:after="100" w:line="240" w:lineRule="exact"/>
+      </w:pPr>
       <w:r>
         <w:rPr>
-          <w:rFonts w:ascii="Calibri" w:hAnsi="Calibri"/>
-          <w:color w:val="444444"/>
-          <w:sz w:val="20"/>
+          <w:rFonts w:ascii="Arial" w:hAnsi="Arial"/>
+          <w:b w:val="0"/>
+          <w:color w:val="555555"/>
+          <w:sz w:val="18"/>
         </w:rPr>
-        <w:t>System design, goal setting, technical approach, delivery coordination, mentoring</w:t>
+        <w:t>Solution design and technical discovery • Requirements translation and MVP definition • Backend services and API architecture • Platform and legacy modernization • Authentication and identity strategy • Cloud-based application delivery • Integration and localization workflows • Technical leadership and mentoring • Cross-functional and distributed-team delivery</w:t>
+      </w:r>
+    </w:p>
+    <w:p>
+      <w:pPr>
+        <w:pStyle w:val="Heading1"/>
+        <w:keepNext/>
+        <w:widowControl/>
+        <w:spacing w:before="240" w:after="120" w:line="240" w:lineRule="exact"/>
+      </w:pPr>
+      <w:r>
+        <w:rPr>
+          <w:rFonts w:ascii="Arial" w:hAnsi="Arial"/>
+          <w:b/>
+          <w:color w:val="2A7A7A"/>
+          <w:sz w:val="18"/>
+        </w:rPr>
+        <w:t>Technical Foundation</w:t>
+      </w:r>
+    </w:p>
+    <w:p>
+      <w:pPr>
+        <w:keepNext w:val="0"/>
+        <w:widowControl/>
+        <w:spacing w:before="0" w:after="100" w:line="240" w:lineRule="exact"/>
+      </w:pPr>
+      <w:r>
+        <w:rPr>
+          <w:rFonts w:ascii="Arial" w:hAnsi="Arial"/>
+          <w:b w:val="0"/>
+          <w:color w:val="555555"/>
+          <w:sz w:val="18"/>
+        </w:rPr>
+        <w:t>Architecture and delivery: System design, technical discovery, service boundaries, modernization roadmaps, authentication, CMS architecture, localization, delivery coordination, mentorship</w:t>
+      </w:r>
+    </w:p>
+    <w:p>
+      <w:pPr>
+        <w:keepNext w:val="0"/>
+        <w:widowControl/>
+        <w:spacing w:before="0" w:after="100" w:line="240" w:lineRule="exact"/>
+      </w:pPr>
+      <w:r>
+        <w:rPr>
+          <w:rFonts w:ascii="Arial" w:hAnsi="Arial"/>
+          <w:b w:val="0"/>
+          <w:color w:val="555555"/>
+          <w:sz w:val="18"/>
+        </w:rPr>
+        <w:t>Cloud and platforms: AWS, Auth0, GitHub Actions, Docker, Vercel, Netlify, Redis, PostgreSQL, Contentful, Strapi</w:t>
+      </w:r>
+    </w:p>
+    <w:p>
+      <w:pPr>
+        <w:keepNext w:val="0"/>
+        <w:widowControl/>
+        <w:spacing w:before="0" w:after="100" w:line="240" w:lineRule="exact"/>
+      </w:pPr>
+      <w:r>
+        <w:rPr>
+          <w:rFonts w:ascii="Arial" w:hAnsi="Arial"/>
+          <w:b w:val="0"/>
+          <w:color w:val="555555"/>
+          <w:sz w:val="18"/>
+        </w:rPr>
+        <w:t>Engineering depth: TypeScript, React, Node.js, Ruby on Rails, SQL, Java, Vue, Next.js, Express, Elixir/Phoenix, PHP, Svelte</w:t>
       </w:r>
     </w:p>
     <w:sectPr>
       <w:pgSz w:w="12240" w:h="15840"/>
-      <w:pgMar w:top="936" w:right="1296" w:bottom="936" w:left="1296" w:header="720" w:footer="720" w:gutter="0"/>
+      <w:pgMar w:top="800" w:right="1080" w:bottom="760" w:left="1080" w:header="720" w:footer="720" w:gutter="0"/>
       <w:cols w:space="720"/>
       <w:docGrid w:linePitch="360"/>
     </w:sectPr>
@@ -947,8 +1196,7 @@
     <w:qFormat/>
     <w:rsid w:val="00FC693F"/>
     <w:rPr>
-      <w:rFonts w:ascii="Calibri" w:hAnsi="Calibri"/>
-      <w:sz w:val="20"/>
+      <w:rFonts w:ascii="Arial" w:hAnsi="Arial"/>
     </w:rPr>
   </w:style>
   <w:style w:type="paragraph" w:styleId="Header">
@@ -1776,9 +2024,6 @@
     <w:qFormat/>
     <w:rsid w:val="00FC693F"/>
     <w:pPr>
-      <w:pBdr>
-        <w:bottom w:val="single" w:sz="4" w:space="4" w:color="4F81BD" w:themeColor="accent1"/>
-      </w:pBdr>
       <w:spacing w:before="200" w:after="280"/>
       <w:ind w:left="936" w:right="936"/>
     </w:pPr>

</xml_diff>